<commit_message>
Added Dices game part 2 design
</commit_message>
<xml_diff>
--- a/DiceGame/docs/Dice Game Part 1 design.docx
+++ b/DiceGame/docs/Dice Game Part 1 design.docx
@@ -383,15 +383,15 @@
       </w:r>
       <w:proofErr w:type="spellEnd"/>
       <w:r>
-        <w:t xml:space="preserve"> here is store user name the user never need to know </w:t>
+        <w:t xml:space="preserve"> here is store user name the user never need to know that but the system </w:t>
       </w:r>
       <w:proofErr w:type="gramStart"/>
       <w:r>
-        <w:t>that</w:t>
+        <w:t>need</w:t>
       </w:r>
       <w:proofErr w:type="gramEnd"/>
       <w:r>
-        <w:t xml:space="preserve"> but the system need to know this.</w:t>
+        <w:t xml:space="preserve"> to know this.</w:t>
       </w:r>
     </w:p>
     <w:p>
@@ -1018,6 +1018,141 @@
     </w:p>
     <w:p>
       <w:pPr>
+        <w:pStyle w:val="Heading2"/>
+      </w:pPr>
+      <w:r>
+        <w:t>Main</w:t>
+      </w:r>
+    </w:p>
+    <w:tbl>
+      <w:tblPr>
+        <w:tblStyle w:val="TableGrid"/>
+        <w:tblW w:w="0" w:type="auto"/>
+        <w:tblLook w:val="04A0" w:firstRow="1" w:lastRow="0" w:firstColumn="1" w:lastColumn="0" w:noHBand="0" w:noVBand="1"/>
+      </w:tblPr>
+      <w:tblGrid>
+        <w:gridCol w:w="5098"/>
+        <w:gridCol w:w="3918"/>
+      </w:tblGrid>
+      <w:tr>
+        <w:tc>
+          <w:tcPr>
+            <w:tcW w:w="5098" w:type="dxa"/>
+          </w:tcPr>
+          <w:p>
+            <w:pPr>
+              <w:jc w:val="center"/>
+            </w:pPr>
+            <w:r>
+              <w:t>Responsibilities</w:t>
+            </w:r>
+          </w:p>
+        </w:tc>
+        <w:tc>
+          <w:tcPr>
+            <w:tcW w:w="3918" w:type="dxa"/>
+          </w:tcPr>
+          <w:p>
+            <w:pPr>
+              <w:jc w:val="center"/>
+            </w:pPr>
+            <w:r>
+              <w:t>Collaborators</w:t>
+            </w:r>
+          </w:p>
+        </w:tc>
+      </w:tr>
+      <w:tr>
+        <w:tc>
+          <w:tcPr>
+            <w:tcW w:w="5098" w:type="dxa"/>
+          </w:tcPr>
+          <w:p>
+            <w:r>
+              <w:t xml:space="preserve">Does: </w:t>
+            </w:r>
+            <w:r>
+              <w:rPr>
+                <w:color w:val="EE0000"/>
+              </w:rPr>
+              <w:t>main</w:t>
+            </w:r>
+          </w:p>
+          <w:p>
+            <w:pPr>
+              <w:pStyle w:val="ListParagraph"/>
+              <w:numPr>
+                <w:ilvl w:val="0"/>
+                <w:numId w:val="2"/>
+              </w:numPr>
+            </w:pPr>
+            <w:proofErr w:type="spellStart"/>
+            <w:proofErr w:type="gramStart"/>
+            <w:r>
+              <w:t>Creates:</w:t>
+            </w:r>
+            <w:r>
+              <w:rPr>
+                <w:color w:val="EE0000"/>
+              </w:rPr>
+              <w:t>gameController</w:t>
+            </w:r>
+            <w:proofErr w:type="spellEnd"/>
+            <w:proofErr w:type="gramEnd"/>
+          </w:p>
+          <w:p>
+            <w:pPr>
+              <w:pStyle w:val="ListParagraph"/>
+              <w:numPr>
+                <w:ilvl w:val="0"/>
+                <w:numId w:val="2"/>
+              </w:numPr>
+            </w:pPr>
+            <w:r>
+              <w:t xml:space="preserve">Call: </w:t>
+            </w:r>
+            <w:proofErr w:type="spellStart"/>
+            <w:r>
+              <w:rPr>
+                <w:color w:val="196B24" w:themeColor="accent3"/>
+              </w:rPr>
+              <w:t>playGames</w:t>
+            </w:r>
+            <w:r>
+              <w:t>.</w:t>
+            </w:r>
+            <w:r>
+              <w:rPr>
+                <w:color w:val="156082" w:themeColor="accent1"/>
+              </w:rPr>
+              <w:t>start</w:t>
+            </w:r>
+            <w:proofErr w:type="spellEnd"/>
+            <w:r>
+              <w:t>()</w:t>
+            </w:r>
+          </w:p>
+        </w:tc>
+        <w:tc>
+          <w:tcPr>
+            <w:tcW w:w="3918" w:type="dxa"/>
+          </w:tcPr>
+          <w:p>
+            <w:proofErr w:type="spellStart"/>
+            <w:r>
+              <w:rPr>
+                <w:color w:val="EE0000"/>
+              </w:rPr>
+              <w:t>GameController</w:t>
+            </w:r>
+            <w:proofErr w:type="spellEnd"/>
+          </w:p>
+        </w:tc>
+      </w:tr>
+    </w:tbl>
+    <w:p/>
+    <w:p>
+      <w:pPr>
         <w:pStyle w:val="Heading3"/>
       </w:pPr>
       <w:proofErr w:type="spellStart"/>
@@ -1042,7 +1177,7 @@
       <w:tr>
         <w:tc>
           <w:tcPr>
-            <w:tcW w:w="5098" w:type="dxa"/>
+            <w:tcW w:w="4654" w:type="dxa"/>
           </w:tcPr>
           <w:p>
             <w:pPr>
@@ -1055,7 +1190,7 @@
         </w:tc>
         <w:tc>
           <w:tcPr>
-            <w:tcW w:w="3918" w:type="dxa"/>
+            <w:tcW w:w="4362" w:type="dxa"/>
           </w:tcPr>
           <w:p>
             <w:pPr>
@@ -1070,7 +1205,7 @@
       <w:tr>
         <w:tc>
           <w:tcPr>
-            <w:tcW w:w="5098" w:type="dxa"/>
+            <w:tcW w:w="4654" w:type="dxa"/>
           </w:tcPr>
           <w:p>
             <w:r>
@@ -1088,7 +1223,7 @@
         </w:tc>
         <w:tc>
           <w:tcPr>
-            <w:tcW w:w="3918" w:type="dxa"/>
+            <w:tcW w:w="4362" w:type="dxa"/>
           </w:tcPr>
           <w:p>
             <w:proofErr w:type="spellStart"/>
@@ -1105,7 +1240,7 @@
       <w:tr>
         <w:tc>
           <w:tcPr>
-            <w:tcW w:w="5098" w:type="dxa"/>
+            <w:tcW w:w="4654" w:type="dxa"/>
           </w:tcPr>
           <w:p>
             <w:r>
@@ -1135,7 +1270,7 @@
         </w:tc>
         <w:tc>
           <w:tcPr>
-            <w:tcW w:w="3918" w:type="dxa"/>
+            <w:tcW w:w="4362" w:type="dxa"/>
           </w:tcPr>
           <w:p>
             <w:proofErr w:type="spellStart"/>
@@ -1172,7 +1307,7 @@
       <w:tr>
         <w:tc>
           <w:tcPr>
-            <w:tcW w:w="5098" w:type="dxa"/>
+            <w:tcW w:w="4654" w:type="dxa"/>
           </w:tcPr>
           <w:p>
             <w:r>
@@ -1190,15 +1325,22 @@
         </w:tc>
         <w:tc>
           <w:tcPr>
-            <w:tcW w:w="3918" w:type="dxa"/>
-          </w:tcPr>
-          <w:p/>
-        </w:tc>
-      </w:tr>
-      <w:tr>
-        <w:tc>
-          <w:tcPr>
-            <w:tcW w:w="5098" w:type="dxa"/>
+            <w:tcW w:w="4362" w:type="dxa"/>
+          </w:tcPr>
+          <w:p>
+            <w:r>
+              <w:rPr>
+                <w:color w:val="EE0000"/>
+              </w:rPr>
+              <w:t>Scanner</w:t>
+            </w:r>
+          </w:p>
+        </w:tc>
+      </w:tr>
+      <w:tr>
+        <w:tc>
+          <w:tcPr>
+            <w:tcW w:w="4654" w:type="dxa"/>
           </w:tcPr>
           <w:p>
             <w:proofErr w:type="gramStart"/>
@@ -1230,7 +1372,134 @@
         </w:tc>
         <w:tc>
           <w:tcPr>
-            <w:tcW w:w="3918" w:type="dxa"/>
+            <w:tcW w:w="4362" w:type="dxa"/>
+          </w:tcPr>
+          <w:p>
+            <w:proofErr w:type="spellStart"/>
+            <w:r>
+              <w:rPr>
+                <w:color w:val="196B24" w:themeColor="accent3"/>
+              </w:rPr>
+              <w:t>userInput</w:t>
+            </w:r>
+            <w:r>
+              <w:t>.</w:t>
+            </w:r>
+            <w:r>
+              <w:rPr>
+                <w:color w:val="4C94D8" w:themeColor="text2" w:themeTint="80"/>
+              </w:rPr>
+              <w:t>nextLine</w:t>
+            </w:r>
+            <w:proofErr w:type="spellEnd"/>
+            <w:r>
+              <w:t>()</w:t>
+            </w:r>
+          </w:p>
+        </w:tc>
+      </w:tr>
+      <w:tr>
+        <w:tc>
+          <w:tcPr>
+            <w:tcW w:w="4654" w:type="dxa"/>
+          </w:tcPr>
+          <w:p>
+            <w:pPr>
+              <w:rPr>
+                <w:color w:val="156082" w:themeColor="accent1"/>
+              </w:rPr>
+            </w:pPr>
+            <w:r>
+              <w:t xml:space="preserve">Does: </w:t>
+            </w:r>
+            <w:r>
+              <w:rPr>
+                <w:color w:val="156082" w:themeColor="accent1"/>
+              </w:rPr>
+              <w:t>Start</w:t>
+            </w:r>
+          </w:p>
+          <w:p>
+            <w:pPr>
+              <w:pStyle w:val="ListParagraph"/>
+              <w:numPr>
+                <w:ilvl w:val="0"/>
+                <w:numId w:val="3"/>
+              </w:numPr>
+            </w:pPr>
+            <w:r>
+              <w:t xml:space="preserve"> </w:t>
+            </w:r>
+            <w:proofErr w:type="spellStart"/>
+            <w:r>
+              <w:rPr>
+                <w:color w:val="156082" w:themeColor="accent1"/>
+              </w:rPr>
+              <w:t>displayWelcomeMessage</w:t>
+            </w:r>
+            <w:proofErr w:type="spellEnd"/>
+          </w:p>
+          <w:p>
+            <w:pPr>
+              <w:pStyle w:val="ListParagraph"/>
+              <w:numPr>
+                <w:ilvl w:val="0"/>
+                <w:numId w:val="3"/>
+              </w:numPr>
+              <w:rPr>
+                <w:color w:val="156082" w:themeColor="accent1"/>
+              </w:rPr>
+            </w:pPr>
+            <w:proofErr w:type="spellStart"/>
+            <w:r>
+              <w:rPr>
+                <w:color w:val="156082" w:themeColor="accent1"/>
+              </w:rPr>
+              <w:t>getUserName</w:t>
+            </w:r>
+            <w:proofErr w:type="spellEnd"/>
+          </w:p>
+          <w:p>
+            <w:pPr>
+              <w:pStyle w:val="ListParagraph"/>
+              <w:numPr>
+                <w:ilvl w:val="0"/>
+                <w:numId w:val="3"/>
+              </w:numPr>
+              <w:rPr>
+                <w:color w:val="156082" w:themeColor="accent1"/>
+              </w:rPr>
+            </w:pPr>
+            <w:proofErr w:type="spellStart"/>
+            <w:r>
+              <w:rPr>
+                <w:color w:val="156082" w:themeColor="accent1"/>
+              </w:rPr>
+              <w:t>playDiceSimulator</w:t>
+            </w:r>
+            <w:proofErr w:type="spellEnd"/>
+            <w:r>
+              <w:rPr>
+                <w:color w:val="156082" w:themeColor="accent1"/>
+              </w:rPr>
+              <w:t xml:space="preserve"> </w:t>
+            </w:r>
+            <w:r>
+              <w:t xml:space="preserve">passing </w:t>
+            </w:r>
+            <w:proofErr w:type="spellStart"/>
+            <w:r>
+              <w:rPr>
+                <w:color w:val="196B24" w:themeColor="accent3"/>
+              </w:rPr>
+              <w:t>userName</w:t>
+            </w:r>
+            <w:proofErr w:type="spellEnd"/>
+          </w:p>
+        </w:tc>
+        <w:tc>
+          <w:tcPr>
+            <w:tcW w:w="4362" w:type="dxa"/>
           </w:tcPr>
           <w:p/>
         </w:tc>
@@ -1238,122 +1507,50 @@
       <w:tr>
         <w:tc>
           <w:tcPr>
-            <w:tcW w:w="5098" w:type="dxa"/>
+            <w:tcW w:w="4654" w:type="dxa"/>
+          </w:tcPr>
+          <w:p>
+            <w:r>
+              <w:t xml:space="preserve">Does: </w:t>
+            </w:r>
+            <w:proofErr w:type="spellStart"/>
+            <w:r>
+              <w:rPr>
+                <w:color w:val="156082" w:themeColor="accent1"/>
+              </w:rPr>
+              <w:t>toString</w:t>
+            </w:r>
+            <w:proofErr w:type="spellEnd"/>
+          </w:p>
+        </w:tc>
+        <w:tc>
+          <w:tcPr>
+            <w:tcW w:w="4362" w:type="dxa"/>
           </w:tcPr>
           <w:p/>
         </w:tc>
-        <w:tc>
-          <w:tcPr>
-            <w:tcW w:w="3918" w:type="dxa"/>
-          </w:tcPr>
-          <w:p/>
-        </w:tc>
-      </w:tr>
-      <w:tr>
-        <w:tc>
-          <w:tcPr>
-            <w:tcW w:w="5098" w:type="dxa"/>
-          </w:tcPr>
-          <w:p>
-            <w:r>
-              <w:t xml:space="preserve">Does: </w:t>
-            </w:r>
-            <w:proofErr w:type="spellStart"/>
-            <w:r>
-              <w:rPr>
-                <w:color w:val="4C94D8" w:themeColor="text2" w:themeTint="80"/>
-              </w:rPr>
-              <w:t>displayWelcomeMessage</w:t>
-            </w:r>
-            <w:proofErr w:type="spellEnd"/>
-          </w:p>
-        </w:tc>
-        <w:tc>
-          <w:tcPr>
-            <w:tcW w:w="3918" w:type="dxa"/>
-          </w:tcPr>
-          <w:p/>
-        </w:tc>
-      </w:tr>
-      <w:tr>
-        <w:tc>
-          <w:tcPr>
-            <w:tcW w:w="5098" w:type="dxa"/>
-          </w:tcPr>
-          <w:p>
-            <w:r>
-              <w:t xml:space="preserve">Does: </w:t>
-            </w:r>
-            <w:proofErr w:type="spellStart"/>
-            <w:r>
-              <w:rPr>
-                <w:color w:val="4C94D8" w:themeColor="text2" w:themeTint="80"/>
-              </w:rPr>
-              <w:t>getUserName</w:t>
-            </w:r>
-            <w:proofErr w:type="spellEnd"/>
-          </w:p>
-        </w:tc>
-        <w:tc>
-          <w:tcPr>
-            <w:tcW w:w="3918" w:type="dxa"/>
-          </w:tcPr>
-          <w:p/>
-        </w:tc>
-      </w:tr>
-      <w:tr>
-        <w:tc>
-          <w:tcPr>
-            <w:tcW w:w="5098" w:type="dxa"/>
-          </w:tcPr>
-          <w:p>
-            <w:r>
-              <w:t xml:space="preserve">Does: </w:t>
-            </w:r>
-            <w:proofErr w:type="spellStart"/>
-            <w:r>
-              <w:rPr>
-                <w:color w:val="4C94D8" w:themeColor="text2" w:themeTint="80"/>
-              </w:rPr>
-              <w:t>playDiceSimulator</w:t>
-            </w:r>
-            <w:proofErr w:type="spellEnd"/>
-            <w:r>
-              <w:t xml:space="preserve"> passing </w:t>
-            </w:r>
-            <w:proofErr w:type="spellStart"/>
-            <w:r>
-              <w:rPr>
-                <w:color w:val="196B24" w:themeColor="accent3"/>
-              </w:rPr>
-              <w:t>uiserName</w:t>
-            </w:r>
-            <w:proofErr w:type="spellEnd"/>
-          </w:p>
-        </w:tc>
-        <w:tc>
-          <w:tcPr>
-            <w:tcW w:w="3918" w:type="dxa"/>
-          </w:tcPr>
-          <w:p/>
-        </w:tc>
-      </w:tr>
-      <w:tr>
-        <w:tc>
-          <w:tcPr>
-            <w:tcW w:w="5098" w:type="dxa"/>
-          </w:tcPr>
-          <w:p/>
-        </w:tc>
-        <w:tc>
-          <w:tcPr>
-            <w:tcW w:w="3918" w:type="dxa"/>
-          </w:tcPr>
-          <w:p/>
-        </w:tc>
       </w:tr>
     </w:tbl>
-    <w:p/>
+    <w:p>
+      <w:r>
+        <w:t>*</w:t>
+      </w:r>
+      <w:proofErr w:type="spellStart"/>
+      <w:r>
+        <w:t>nextLine</w:t>
+      </w:r>
+      <w:proofErr w:type="spellEnd"/>
+      <w:r>
+        <w:t xml:space="preserve"> method adde</w:t>
+      </w:r>
+      <w:r>
+        <w:t>d</w:t>
+      </w:r>
+      <w:r>
+        <w:br/>
+        <w:t>*start method added</w:t>
+      </w:r>
+    </w:p>
     <w:p>
       <w:pPr>
         <w:pStyle w:val="Heading3"/>
@@ -1443,13 +1640,10 @@
               <w:t xml:space="preserve">Holds: </w:t>
             </w:r>
             <w:r>
-              <w:t>dice</w:t>
-            </w:r>
-            <w:r>
               <w:rPr>
                 <w:color w:val="196B24" w:themeColor="accent3"/>
               </w:rPr>
-              <w:t xml:space="preserve"> </w:t>
+              <w:t xml:space="preserve">dice </w:t>
             </w:r>
             <w:r>
               <w:t xml:space="preserve">(instance of </w:t>
@@ -1511,13 +1705,13 @@
               </w:rPr>
               <w:t>rollResult</w:t>
             </w:r>
+            <w:r>
+              <w:rPr>
+                <w:color w:val="196B24" w:themeColor="accent3"/>
+              </w:rPr>
+              <w:t>s</w:t>
+            </w:r>
             <w:proofErr w:type="spellEnd"/>
-            <w:r>
-              <w:rPr>
-                <w:color w:val="196B24" w:themeColor="accent3"/>
-              </w:rPr>
-              <w:t xml:space="preserve"> </w:t>
-            </w:r>
           </w:p>
         </w:tc>
         <w:tc>
@@ -1799,11 +1993,13 @@
       </w:tr>
     </w:tbl>
     <w:p/>
+    <w:p/>
     <w:p>
       <w:pPr>
         <w:pStyle w:val="Heading3"/>
       </w:pPr>
       <w:r>
+        <w:lastRenderedPageBreak/>
         <w:t>Dice</w:t>
       </w:r>
     </w:p>
@@ -1865,7 +2061,13 @@
               <w:rPr>
                 <w:color w:val="196B24" w:themeColor="accent3"/>
               </w:rPr>
-              <w:t>lValue</w:t>
+              <w:t>l</w:t>
+            </w:r>
+            <w:r>
+              <w:rPr>
+                <w:color w:val="196B24" w:themeColor="accent3"/>
+              </w:rPr>
+              <w:t>Result</w:t>
             </w:r>
             <w:proofErr w:type="spellEnd"/>
           </w:p>
@@ -1874,21 +2076,14 @@
           <w:tcPr>
             <w:tcW w:w="3918" w:type="dxa"/>
           </w:tcPr>
-          <w:p/>
-        </w:tc>
-      </w:tr>
-      <w:tr>
-        <w:tc>
-          <w:tcPr>
-            <w:tcW w:w="5098" w:type="dxa"/>
-          </w:tcPr>
-          <w:p/>
-        </w:tc>
-        <w:tc>
-          <w:tcPr>
-            <w:tcW w:w="3918" w:type="dxa"/>
-          </w:tcPr>
-          <w:p/>
+          <w:p>
+            <w:r>
+              <w:rPr>
+                <w:color w:val="EE0000"/>
+              </w:rPr>
+              <w:t>Random</w:t>
+            </w:r>
+          </w:p>
         </w:tc>
       </w:tr>
       <w:tr>
@@ -1900,27 +2095,148 @@
             <w:proofErr w:type="spellStart"/>
             <w:proofErr w:type="gramStart"/>
             <w:r>
-              <w:t>Does:</w:t>
-            </w:r>
-            <w:r>
-              <w:rPr>
-                <w:color w:val="4C94D8" w:themeColor="text2" w:themeTint="80"/>
-              </w:rPr>
-              <w:t>rollDice</w:t>
+              <w:t>Holds:</w:t>
+            </w:r>
+            <w:r>
+              <w:rPr>
+                <w:color w:val="196B24" w:themeColor="accent3"/>
+              </w:rPr>
+              <w:t>r</w:t>
+            </w:r>
+            <w:r>
+              <w:rPr>
+                <w:color w:val="196B24" w:themeColor="accent3"/>
+              </w:rPr>
+              <w:t>andom</w:t>
             </w:r>
             <w:proofErr w:type="spellEnd"/>
             <w:proofErr w:type="gramEnd"/>
+            <w:r>
+              <w:t xml:space="preserve">(instance of </w:t>
+            </w:r>
+            <w:r>
+              <w:rPr>
+                <w:color w:val="EE0000"/>
+              </w:rPr>
+              <w:t>Random</w:t>
+            </w:r>
+            <w:r>
+              <w:t>)</w:t>
+            </w:r>
           </w:p>
         </w:tc>
         <w:tc>
           <w:tcPr>
             <w:tcW w:w="3918" w:type="dxa"/>
           </w:tcPr>
+          <w:p>
+            <w:proofErr w:type="spellStart"/>
+            <w:proofErr w:type="gramStart"/>
+            <w:r>
+              <w:rPr>
+                <w:color w:val="196B24" w:themeColor="accent3"/>
+              </w:rPr>
+              <w:t>r</w:t>
+            </w:r>
+            <w:r>
+              <w:rPr>
+                <w:color w:val="196B24" w:themeColor="accent3"/>
+              </w:rPr>
+              <w:t>andom</w:t>
+            </w:r>
+            <w:r>
+              <w:t>.</w:t>
+            </w:r>
+            <w:r>
+              <w:rPr>
+                <w:color w:val="0F9ED5" w:themeColor="accent4"/>
+              </w:rPr>
+              <w:t>nextInt</w:t>
+            </w:r>
+            <w:proofErr w:type="spellEnd"/>
+            <w:proofErr w:type="gramEnd"/>
+            <w:r>
+              <w:t>(6)</w:t>
+            </w:r>
+          </w:p>
+        </w:tc>
+      </w:tr>
+      <w:tr>
+        <w:tc>
+          <w:tcPr>
+            <w:tcW w:w="5098" w:type="dxa"/>
+          </w:tcPr>
           <w:p/>
         </w:tc>
+        <w:tc>
+          <w:tcPr>
+            <w:tcW w:w="3918" w:type="dxa"/>
+          </w:tcPr>
+          <w:p/>
+        </w:tc>
+      </w:tr>
+      <w:tr>
+        <w:tc>
+          <w:tcPr>
+            <w:tcW w:w="5098" w:type="dxa"/>
+          </w:tcPr>
+          <w:p>
+            <w:proofErr w:type="spellStart"/>
+            <w:proofErr w:type="gramStart"/>
+            <w:r>
+              <w:t>Does:</w:t>
+            </w:r>
+            <w:r>
+              <w:rPr>
+                <w:color w:val="4C94D8" w:themeColor="text2" w:themeTint="80"/>
+              </w:rPr>
+              <w:t>rollDice</w:t>
+            </w:r>
+            <w:proofErr w:type="spellEnd"/>
+            <w:proofErr w:type="gramEnd"/>
+            <w:r>
+              <w:rPr>
+                <w:color w:val="4C94D8" w:themeColor="text2" w:themeTint="80"/>
+              </w:rPr>
+              <w:t xml:space="preserve"> </w:t>
+            </w:r>
+          </w:p>
+        </w:tc>
+        <w:tc>
+          <w:tcPr>
+            <w:tcW w:w="3918" w:type="dxa"/>
+          </w:tcPr>
+          <w:p/>
+        </w:tc>
       </w:tr>
     </w:tbl>
-    <w:p/>
+    <w:p>
+      <w:r>
+        <w:t>*</w:t>
+      </w:r>
+      <w:proofErr w:type="gramStart"/>
+      <w:r>
+        <w:t>added</w:t>
+      </w:r>
+      <w:proofErr w:type="gramEnd"/>
+      <w:r>
+        <w:t xml:space="preserve"> r</w:t>
+      </w:r>
+      <w:r>
+        <w:t>andom</w:t>
+      </w:r>
+      <w:r>
+        <w:t xml:space="preserve"> and method of </w:t>
+      </w:r>
+      <w:proofErr w:type="spellStart"/>
+      <w:r>
+        <w:t>next</w:t>
+      </w:r>
+      <w:r>
+        <w:t>Int</w:t>
+      </w:r>
+      <w:proofErr w:type="spellEnd"/>
+    </w:p>
     <w:sectPr>
       <w:pgSz w:w="11906" w:h="16838"/>
       <w:pgMar w:top="1440" w:right="1440" w:bottom="1440" w:left="1440" w:header="708" w:footer="708" w:gutter="0"/>
@@ -1934,9 +2250,9 @@
 <file path=word/numbering.xml><?xml version="1.0" encoding="utf-8"?>
 <w:numbering xmlns:wpc="http://schemas.microsoft.com/office/word/2010/wordprocessingCanvas" xmlns:cx="http://schemas.microsoft.com/office/drawing/2014/chartex" xmlns:cx1="http://schemas.microsoft.com/office/drawing/2015/9/8/chartex" xmlns:cx2="http://schemas.microsoft.com/office/drawing/2015/10/21/chartex" xmlns:cx3="http://schemas.microsoft.com/office/drawing/2016/5/9/chartex" xmlns:cx4="http://schemas.microsoft.com/office/drawing/2016/5/10/chartex" xmlns:cx5="http://schemas.microsoft.com/office/drawing/2016/5/11/chartex" xmlns:cx6="http://schemas.microsoft.com/office/drawing/2016/5/12/chartex" xmlns:cx7="http://schemas.microsoft.com/office/drawing/2016/5/13/chartex" xmlns:cx8="http://schemas.microsoft.com/office/drawing/2016/5/14/chartex" xmlns:mc="http://schemas.openxmlformats.org/markup-compatibility/2006" xmlns:aink="http://schemas.microsoft.com/office/drawing/2016/ink" xmlns:am3d="http://schemas.microsoft.com/office/drawing/2017/model3d" xmlns:o="urn:schemas-microsoft-com:office:office" xmlns:oel="http://schemas.microsoft.com/office/2019/extlst" xmlns:r="http://schemas.openxmlformats.org/officeDocument/2006/relationships" xmlns:m="http://schemas.openxmlformats.org/officeDocument/2006/math" xmlns:v="urn:schemas-microsoft-com:vml" xmlns:wp14="http://schemas.microsoft.com/office/word/2010/wordprocessingDrawing" xmlns:wp="http://schemas.openxmlformats.org/drawingml/2006/wordprocessingDrawing" xmlns:w10="urn:schemas-microsoft-com:office:word" xmlns:w="http://schemas.openxmlformats.org/wordprocessingml/2006/main" xmlns:w14="http://schemas.microsoft.com/office/word/2010/wordml" xmlns:w15="http://schemas.microsoft.com/office/word/2012/wordml" xmlns:w16cex="http://schemas.microsoft.com/office/word/2018/wordml/cex" xmlns:w16cid="http://schemas.microsoft.com/office/word/2016/wordml/cid" xmlns:w16="http://schemas.microsoft.com/office/word/2018/wordml" xmlns:w16du="http://schemas.microsoft.com/office/word/2023/wordml/word16du" xmlns:w16sdtdh="http://schemas.microsoft.com/office/word/2020/wordml/sdtdatahash" xmlns:w16sdtfl="http://schemas.microsoft.com/office/word/2024/wordml/sdtformatlock" xmlns:w16se="http://schemas.microsoft.com/office/word/2015/wordml/symex" xmlns:wpg="http://schemas.microsoft.com/office/word/2010/wordprocessingGroup" xmlns:wpi="http://schemas.microsoft.com/office/word/2010/wordprocessingInk" xmlns:wne="http://schemas.microsoft.com/office/word/2006/wordml" xmlns:wps="http://schemas.microsoft.com/office/word/2010/wordprocessingShape" mc:Ignorable="w14 w15 w16se w16cid w16 w16cex w16sdtdh w16sdtfl w16du wp14">
   <w:abstractNum w:abstractNumId="0" w15:restartNumberingAfterBreak="0">
-    <w:nsid w:val="7EFA1CFE"/>
+    <w:nsid w:val="16921FDD"/>
     <w:multiLevelType w:val="hybridMultilevel"/>
-    <w:tmpl w:val="CA06F220"/>
+    <w:tmpl w:val="17B01A80"/>
     <w:lvl w:ilvl="0" w:tplc="08090001">
       <w:start w:val="1"/>
       <w:numFmt w:val="bullet"/>
@@ -2046,8 +2362,356 @@
       </w:rPr>
     </w:lvl>
   </w:abstractNum>
+  <w:abstractNum w:abstractNumId="1" w15:restartNumberingAfterBreak="0">
+    <w:nsid w:val="16974353"/>
+    <w:multiLevelType w:val="hybridMultilevel"/>
+    <w:tmpl w:val="88523EF2"/>
+    <w:lvl w:ilvl="0" w:tplc="0809000F">
+      <w:start w:val="1"/>
+      <w:numFmt w:val="decimal"/>
+      <w:lvlText w:val="%1."/>
+      <w:lvlJc w:val="left"/>
+      <w:pPr>
+        <w:ind w:left="720" w:hanging="360"/>
+      </w:pPr>
+      <w:rPr>
+        <w:rFonts w:hint="default"/>
+      </w:rPr>
+    </w:lvl>
+    <w:lvl w:ilvl="1" w:tplc="FFFFFFFF" w:tentative="1">
+      <w:start w:val="1"/>
+      <w:numFmt w:val="bullet"/>
+      <w:lvlText w:val="o"/>
+      <w:lvlJc w:val="left"/>
+      <w:pPr>
+        <w:ind w:left="1440" w:hanging="360"/>
+      </w:pPr>
+      <w:rPr>
+        <w:rFonts w:ascii="Courier New" w:hAnsi="Courier New" w:cs="Courier New" w:hint="default"/>
+      </w:rPr>
+    </w:lvl>
+    <w:lvl w:ilvl="2" w:tplc="FFFFFFFF" w:tentative="1">
+      <w:start w:val="1"/>
+      <w:numFmt w:val="bullet"/>
+      <w:lvlText w:val=""/>
+      <w:lvlJc w:val="left"/>
+      <w:pPr>
+        <w:ind w:left="2160" w:hanging="360"/>
+      </w:pPr>
+      <w:rPr>
+        <w:rFonts w:ascii="Wingdings" w:hAnsi="Wingdings" w:hint="default"/>
+      </w:rPr>
+    </w:lvl>
+    <w:lvl w:ilvl="3" w:tplc="FFFFFFFF" w:tentative="1">
+      <w:start w:val="1"/>
+      <w:numFmt w:val="bullet"/>
+      <w:lvlText w:val=""/>
+      <w:lvlJc w:val="left"/>
+      <w:pPr>
+        <w:ind w:left="2880" w:hanging="360"/>
+      </w:pPr>
+      <w:rPr>
+        <w:rFonts w:ascii="Symbol" w:hAnsi="Symbol" w:hint="default"/>
+      </w:rPr>
+    </w:lvl>
+    <w:lvl w:ilvl="4" w:tplc="FFFFFFFF" w:tentative="1">
+      <w:start w:val="1"/>
+      <w:numFmt w:val="bullet"/>
+      <w:lvlText w:val="o"/>
+      <w:lvlJc w:val="left"/>
+      <w:pPr>
+        <w:ind w:left="3600" w:hanging="360"/>
+      </w:pPr>
+      <w:rPr>
+        <w:rFonts w:ascii="Courier New" w:hAnsi="Courier New" w:cs="Courier New" w:hint="default"/>
+      </w:rPr>
+    </w:lvl>
+    <w:lvl w:ilvl="5" w:tplc="FFFFFFFF" w:tentative="1">
+      <w:start w:val="1"/>
+      <w:numFmt w:val="bullet"/>
+      <w:lvlText w:val=""/>
+      <w:lvlJc w:val="left"/>
+      <w:pPr>
+        <w:ind w:left="4320" w:hanging="360"/>
+      </w:pPr>
+      <w:rPr>
+        <w:rFonts w:ascii="Wingdings" w:hAnsi="Wingdings" w:hint="default"/>
+      </w:rPr>
+    </w:lvl>
+    <w:lvl w:ilvl="6" w:tplc="FFFFFFFF" w:tentative="1">
+      <w:start w:val="1"/>
+      <w:numFmt w:val="bullet"/>
+      <w:lvlText w:val=""/>
+      <w:lvlJc w:val="left"/>
+      <w:pPr>
+        <w:ind w:left="5040" w:hanging="360"/>
+      </w:pPr>
+      <w:rPr>
+        <w:rFonts w:ascii="Symbol" w:hAnsi="Symbol" w:hint="default"/>
+      </w:rPr>
+    </w:lvl>
+    <w:lvl w:ilvl="7" w:tplc="FFFFFFFF" w:tentative="1">
+      <w:start w:val="1"/>
+      <w:numFmt w:val="bullet"/>
+      <w:lvlText w:val="o"/>
+      <w:lvlJc w:val="left"/>
+      <w:pPr>
+        <w:ind w:left="5760" w:hanging="360"/>
+      </w:pPr>
+      <w:rPr>
+        <w:rFonts w:ascii="Courier New" w:hAnsi="Courier New" w:cs="Courier New" w:hint="default"/>
+      </w:rPr>
+    </w:lvl>
+    <w:lvl w:ilvl="8" w:tplc="FFFFFFFF" w:tentative="1">
+      <w:start w:val="1"/>
+      <w:numFmt w:val="bullet"/>
+      <w:lvlText w:val=""/>
+      <w:lvlJc w:val="left"/>
+      <w:pPr>
+        <w:ind w:left="6480" w:hanging="360"/>
+      </w:pPr>
+      <w:rPr>
+        <w:rFonts w:ascii="Wingdings" w:hAnsi="Wingdings" w:hint="default"/>
+      </w:rPr>
+    </w:lvl>
+  </w:abstractNum>
+  <w:abstractNum w:abstractNumId="2" w15:restartNumberingAfterBreak="0">
+    <w:nsid w:val="26E61299"/>
+    <w:multiLevelType w:val="hybridMultilevel"/>
+    <w:tmpl w:val="33FA8028"/>
+    <w:lvl w:ilvl="0" w:tplc="08090001">
+      <w:start w:val="1"/>
+      <w:numFmt w:val="bullet"/>
+      <w:lvlText w:val=""/>
+      <w:lvlJc w:val="left"/>
+      <w:pPr>
+        <w:ind w:left="720" w:hanging="360"/>
+      </w:pPr>
+      <w:rPr>
+        <w:rFonts w:ascii="Symbol" w:hAnsi="Symbol" w:hint="default"/>
+      </w:rPr>
+    </w:lvl>
+    <w:lvl w:ilvl="1" w:tplc="08090003" w:tentative="1">
+      <w:start w:val="1"/>
+      <w:numFmt w:val="bullet"/>
+      <w:lvlText w:val="o"/>
+      <w:lvlJc w:val="left"/>
+      <w:pPr>
+        <w:ind w:left="1440" w:hanging="360"/>
+      </w:pPr>
+      <w:rPr>
+        <w:rFonts w:ascii="Courier New" w:hAnsi="Courier New" w:cs="Courier New" w:hint="default"/>
+      </w:rPr>
+    </w:lvl>
+    <w:lvl w:ilvl="2" w:tplc="08090005" w:tentative="1">
+      <w:start w:val="1"/>
+      <w:numFmt w:val="bullet"/>
+      <w:lvlText w:val=""/>
+      <w:lvlJc w:val="left"/>
+      <w:pPr>
+        <w:ind w:left="2160" w:hanging="360"/>
+      </w:pPr>
+      <w:rPr>
+        <w:rFonts w:ascii="Wingdings" w:hAnsi="Wingdings" w:hint="default"/>
+      </w:rPr>
+    </w:lvl>
+    <w:lvl w:ilvl="3" w:tplc="08090001" w:tentative="1">
+      <w:start w:val="1"/>
+      <w:numFmt w:val="bullet"/>
+      <w:lvlText w:val=""/>
+      <w:lvlJc w:val="left"/>
+      <w:pPr>
+        <w:ind w:left="2880" w:hanging="360"/>
+      </w:pPr>
+      <w:rPr>
+        <w:rFonts w:ascii="Symbol" w:hAnsi="Symbol" w:hint="default"/>
+      </w:rPr>
+    </w:lvl>
+    <w:lvl w:ilvl="4" w:tplc="08090003" w:tentative="1">
+      <w:start w:val="1"/>
+      <w:numFmt w:val="bullet"/>
+      <w:lvlText w:val="o"/>
+      <w:lvlJc w:val="left"/>
+      <w:pPr>
+        <w:ind w:left="3600" w:hanging="360"/>
+      </w:pPr>
+      <w:rPr>
+        <w:rFonts w:ascii="Courier New" w:hAnsi="Courier New" w:cs="Courier New" w:hint="default"/>
+      </w:rPr>
+    </w:lvl>
+    <w:lvl w:ilvl="5" w:tplc="08090005" w:tentative="1">
+      <w:start w:val="1"/>
+      <w:numFmt w:val="bullet"/>
+      <w:lvlText w:val=""/>
+      <w:lvlJc w:val="left"/>
+      <w:pPr>
+        <w:ind w:left="4320" w:hanging="360"/>
+      </w:pPr>
+      <w:rPr>
+        <w:rFonts w:ascii="Wingdings" w:hAnsi="Wingdings" w:hint="default"/>
+      </w:rPr>
+    </w:lvl>
+    <w:lvl w:ilvl="6" w:tplc="08090001" w:tentative="1">
+      <w:start w:val="1"/>
+      <w:numFmt w:val="bullet"/>
+      <w:lvlText w:val=""/>
+      <w:lvlJc w:val="left"/>
+      <w:pPr>
+        <w:ind w:left="5040" w:hanging="360"/>
+      </w:pPr>
+      <w:rPr>
+        <w:rFonts w:ascii="Symbol" w:hAnsi="Symbol" w:hint="default"/>
+      </w:rPr>
+    </w:lvl>
+    <w:lvl w:ilvl="7" w:tplc="08090003" w:tentative="1">
+      <w:start w:val="1"/>
+      <w:numFmt w:val="bullet"/>
+      <w:lvlText w:val="o"/>
+      <w:lvlJc w:val="left"/>
+      <w:pPr>
+        <w:ind w:left="5760" w:hanging="360"/>
+      </w:pPr>
+      <w:rPr>
+        <w:rFonts w:ascii="Courier New" w:hAnsi="Courier New" w:cs="Courier New" w:hint="default"/>
+      </w:rPr>
+    </w:lvl>
+    <w:lvl w:ilvl="8" w:tplc="08090005" w:tentative="1">
+      <w:start w:val="1"/>
+      <w:numFmt w:val="bullet"/>
+      <w:lvlText w:val=""/>
+      <w:lvlJc w:val="left"/>
+      <w:pPr>
+        <w:ind w:left="6480" w:hanging="360"/>
+      </w:pPr>
+      <w:rPr>
+        <w:rFonts w:ascii="Wingdings" w:hAnsi="Wingdings" w:hint="default"/>
+      </w:rPr>
+    </w:lvl>
+  </w:abstractNum>
+  <w:abstractNum w:abstractNumId="3" w15:restartNumberingAfterBreak="0">
+    <w:nsid w:val="7EFA1CFE"/>
+    <w:multiLevelType w:val="hybridMultilevel"/>
+    <w:tmpl w:val="CA06F220"/>
+    <w:lvl w:ilvl="0" w:tplc="08090001">
+      <w:start w:val="1"/>
+      <w:numFmt w:val="bullet"/>
+      <w:lvlText w:val=""/>
+      <w:lvlJc w:val="left"/>
+      <w:pPr>
+        <w:ind w:left="720" w:hanging="360"/>
+      </w:pPr>
+      <w:rPr>
+        <w:rFonts w:ascii="Symbol" w:hAnsi="Symbol" w:hint="default"/>
+      </w:rPr>
+    </w:lvl>
+    <w:lvl w:ilvl="1" w:tplc="08090003" w:tentative="1">
+      <w:start w:val="1"/>
+      <w:numFmt w:val="bullet"/>
+      <w:lvlText w:val="o"/>
+      <w:lvlJc w:val="left"/>
+      <w:pPr>
+        <w:ind w:left="1440" w:hanging="360"/>
+      </w:pPr>
+      <w:rPr>
+        <w:rFonts w:ascii="Courier New" w:hAnsi="Courier New" w:cs="Courier New" w:hint="default"/>
+      </w:rPr>
+    </w:lvl>
+    <w:lvl w:ilvl="2" w:tplc="08090005" w:tentative="1">
+      <w:start w:val="1"/>
+      <w:numFmt w:val="bullet"/>
+      <w:lvlText w:val=""/>
+      <w:lvlJc w:val="left"/>
+      <w:pPr>
+        <w:ind w:left="2160" w:hanging="360"/>
+      </w:pPr>
+      <w:rPr>
+        <w:rFonts w:ascii="Wingdings" w:hAnsi="Wingdings" w:hint="default"/>
+      </w:rPr>
+    </w:lvl>
+    <w:lvl w:ilvl="3" w:tplc="08090001" w:tentative="1">
+      <w:start w:val="1"/>
+      <w:numFmt w:val="bullet"/>
+      <w:lvlText w:val=""/>
+      <w:lvlJc w:val="left"/>
+      <w:pPr>
+        <w:ind w:left="2880" w:hanging="360"/>
+      </w:pPr>
+      <w:rPr>
+        <w:rFonts w:ascii="Symbol" w:hAnsi="Symbol" w:hint="default"/>
+      </w:rPr>
+    </w:lvl>
+    <w:lvl w:ilvl="4" w:tplc="08090003" w:tentative="1">
+      <w:start w:val="1"/>
+      <w:numFmt w:val="bullet"/>
+      <w:lvlText w:val="o"/>
+      <w:lvlJc w:val="left"/>
+      <w:pPr>
+        <w:ind w:left="3600" w:hanging="360"/>
+      </w:pPr>
+      <w:rPr>
+        <w:rFonts w:ascii="Courier New" w:hAnsi="Courier New" w:cs="Courier New" w:hint="default"/>
+      </w:rPr>
+    </w:lvl>
+    <w:lvl w:ilvl="5" w:tplc="08090005" w:tentative="1">
+      <w:start w:val="1"/>
+      <w:numFmt w:val="bullet"/>
+      <w:lvlText w:val=""/>
+      <w:lvlJc w:val="left"/>
+      <w:pPr>
+        <w:ind w:left="4320" w:hanging="360"/>
+      </w:pPr>
+      <w:rPr>
+        <w:rFonts w:ascii="Wingdings" w:hAnsi="Wingdings" w:hint="default"/>
+      </w:rPr>
+    </w:lvl>
+    <w:lvl w:ilvl="6" w:tplc="08090001" w:tentative="1">
+      <w:start w:val="1"/>
+      <w:numFmt w:val="bullet"/>
+      <w:lvlText w:val=""/>
+      <w:lvlJc w:val="left"/>
+      <w:pPr>
+        <w:ind w:left="5040" w:hanging="360"/>
+      </w:pPr>
+      <w:rPr>
+        <w:rFonts w:ascii="Symbol" w:hAnsi="Symbol" w:hint="default"/>
+      </w:rPr>
+    </w:lvl>
+    <w:lvl w:ilvl="7" w:tplc="08090003" w:tentative="1">
+      <w:start w:val="1"/>
+      <w:numFmt w:val="bullet"/>
+      <w:lvlText w:val="o"/>
+      <w:lvlJc w:val="left"/>
+      <w:pPr>
+        <w:ind w:left="5760" w:hanging="360"/>
+      </w:pPr>
+      <w:rPr>
+        <w:rFonts w:ascii="Courier New" w:hAnsi="Courier New" w:cs="Courier New" w:hint="default"/>
+      </w:rPr>
+    </w:lvl>
+    <w:lvl w:ilvl="8" w:tplc="08090005" w:tentative="1">
+      <w:start w:val="1"/>
+      <w:numFmt w:val="bullet"/>
+      <w:lvlText w:val=""/>
+      <w:lvlJc w:val="left"/>
+      <w:pPr>
+        <w:ind w:left="6480" w:hanging="360"/>
+      </w:pPr>
+      <w:rPr>
+        <w:rFonts w:ascii="Wingdings" w:hAnsi="Wingdings" w:hint="default"/>
+      </w:rPr>
+    </w:lvl>
+  </w:abstractNum>
   <w:num w:numId="1" w16cid:durableId="484904620">
+    <w:abstractNumId w:val="3"/>
+  </w:num>
+  <w:num w:numId="2" w16cid:durableId="814104483">
     <w:abstractNumId w:val="0"/>
+  </w:num>
+  <w:num w:numId="3" w16cid:durableId="1913814425">
+    <w:abstractNumId w:val="2"/>
+  </w:num>
+  <w:num w:numId="4" w16cid:durableId="189031251">
+    <w:abstractNumId w:val="1"/>
   </w:num>
 </w:numbering>
 </file>
@@ -2653,7 +3317,6 @@
   <w:style w:type="character" w:default="1" w:styleId="DefaultParagraphFont">
     <w:name w:val="Default Paragraph Font"/>
     <w:uiPriority w:val="1"/>
-    <w:semiHidden/>
     <w:unhideWhenUsed/>
   </w:style>
   <w:style w:type="table" w:default="1" w:styleId="TableNormal">

</xml_diff>